<commit_message>
Updated the agent architecture and created week 4 progress report
</commit_message>
<xml_diff>
--- a/docs/weekly-reports/Week3_Progress_Report.docx
+++ b/docs/weekly-reports/Week3_Progress_Report.docx
@@ -1,6 +1,6 @@
 
 <file path=word/document.xml><?xml version="1.0" encoding="utf-8"?>
-<w:document xmlns:wpc="http://schemas.microsoft.com/office/word/2010/wordprocessingCanvas" xmlns:cx="http://schemas.microsoft.com/office/drawing/2014/chartex" xmlns:cx1="http://schemas.microsoft.com/office/drawing/2015/9/8/chartex" xmlns:cx2="http://schemas.microsoft.com/office/drawing/2015/10/21/chartex" xmlns:cx3="http://schemas.microsoft.com/office/drawing/2016/5/9/chartex" xmlns:cx4="http://schemas.microsoft.com/office/drawing/2016/5/10/chartex" xmlns:cx5="http://schemas.microsoft.com/office/drawing/2016/5/11/chartex" xmlns:cx6="http://schemas.microsoft.com/office/drawing/2016/5/12/chartex" xmlns:cx7="http://schemas.microsoft.com/office/drawing/2016/5/13/chartex" xmlns:cx8="http://schemas.microsoft.com/office/drawing/2016/5/14/chartex" xmlns:mc="http://schemas.openxmlformats.org/markup-compatibility/2006" xmlns:aink="http://schemas.microsoft.com/office/drawing/2016/ink" xmlns:am3d="http://schemas.microsoft.com/office/drawing/2017/model3d" xmlns:o="urn:schemas-microsoft-com:office:office" xmlns:oel="http://schemas.microsoft.com/office/2019/extlst" xmlns:r="http://schemas.openxmlformats.org/officeDocument/2006/relationships" xmlns:m="http://schemas.openxmlformats.org/officeDocument/2006/math" xmlns:v="urn:schemas-microsoft-com:vml" xmlns:wp14="http://schemas.microsoft.com/office/word/2010/wordprocessingDrawing" xmlns:wp="http://schemas.openxmlformats.org/drawingml/2006/wordprocessingDrawing" xmlns:w10="urn:schemas-microsoft-com:office:word" xmlns:w="http://schemas.openxmlformats.org/wordprocessingml/2006/main" xmlns:w14="http://schemas.microsoft.com/office/word/2010/wordml" xmlns:w15="http://schemas.microsoft.com/office/word/2012/wordml" xmlns:w16cex="http://schemas.microsoft.com/office/word/2018/wordml/cex" xmlns:w16cid="http://schemas.microsoft.com/office/word/2016/wordml/cid" xmlns:w16="http://schemas.microsoft.com/office/word/2018/wordml" xmlns:w16du="http://schemas.microsoft.com/office/word/2023/wordml/word16du" xmlns:w16sdtdh="http://schemas.microsoft.com/office/word/2020/wordml/sdtdatahash" xmlns:w16sdtfl="http://schemas.microsoft.com/office/word/2024/wordml/sdtformatlock" xmlns:w16se="http://schemas.microsoft.com/office/word/2015/wordml/symex" xmlns:wpg="http://schemas.microsoft.com/office/word/2010/wordprocessingGroup" xmlns:wpi="http://schemas.microsoft.com/office/word/2010/wordprocessingInk" xmlns:wne="http://schemas.microsoft.com/office/word/2006/wordml" xmlns:wps="http://schemas.microsoft.com/office/word/2010/wordprocessingShape" mc:Ignorable="w14 w15 w16se w16cid w16 w16cex w16sdtdh w16sdtfl w16du wp14">
+<w:document xmlns:wpc="http://schemas.microsoft.com/office/word/2010/wordprocessingCanvas" xmlns:mc="http://schemas.openxmlformats.org/markup-compatibility/2006" xmlns:o="urn:schemas-microsoft-com:office:office" xmlns:r="http://schemas.openxmlformats.org/officeDocument/2006/relationships" xmlns:m="http://schemas.openxmlformats.org/officeDocument/2006/math" xmlns:v="urn:schemas-microsoft-com:vml" xmlns:wp14="http://schemas.microsoft.com/office/word/2010/wordprocessingDrawing" xmlns:wp="http://schemas.openxmlformats.org/drawingml/2006/wordprocessingDrawing" xmlns:w10="urn:schemas-microsoft-com:office:word" xmlns:w="http://schemas.openxmlformats.org/wordprocessingml/2006/main" xmlns:w14="http://schemas.microsoft.com/office/word/2010/wordml" xmlns:w15="http://schemas.microsoft.com/office/word/2012/wordml" xmlns:wpg="http://schemas.microsoft.com/office/word/2010/wordprocessingGroup" xmlns:wpi="http://schemas.microsoft.com/office/word/2010/wordprocessingInk" xmlns:wne="http://schemas.microsoft.com/office/word/2006/wordml" xmlns:wps="http://schemas.microsoft.com/office/word/2010/wordprocessingShape" mc:Ignorable="w14 w15 wp14">
   <w:body>
     <w:p>
       <w:pPr>
@@ -70,13 +70,19 @@
         <w:spacing w:after="120"/>
       </w:pPr>
       <w:r>
-        <w:t>Week 2 established a foundation model (Gemini 2.0 Flash) and a versioned system prompt, but every answer still came from the model’s parametric memory. The Week 3 goal was to make the helpdesk</w:t>
+        <w:t xml:space="preserve">Week 2 established a foundation model </w:t>
+      </w:r>
+      <w:r>
+        <w:t>(Gemini 2.0 Flash) and a versioned system prompt, but every answer still came from the model’s parametric memory. The Week 3 goal was to make the helpdesk</w:t>
       </w:r>
       <w:r>
         <w:t xml:space="preserve"> agent</w:t>
       </w:r>
       <w:r>
-        <w:t xml:space="preserve"> answer from a controlled, traceable knowledge source instead: a curated corpus of Centenary Bank material, retrieved at query time and passed to the model as explicit evidence, with each answer carrying a trace back to the documents that produced it.</w:t>
+        <w:t xml:space="preserve"> answer from a controlled, traceable knowledge source instead: a curated corpus of Centenary Ban</w:t>
+      </w:r>
+      <w:r>
+        <w:t>k material, retrieved at query time and passed to the model as explicit evidence, with each answer carrying a trace back to the documents that produced it.</w:t>
       </w:r>
     </w:p>
     <w:p>
@@ -138,25 +144,51 @@
       <w:r>
         <w:t xml:space="preserve">Figure </w:t>
       </w:r>
-      <w:fldSimple w:instr=" STYLEREF 1 \s ">
-        <w:r>
-          <w:rPr>
-            <w:noProof/>
-          </w:rPr>
-          <w:t>0</w:t>
-        </w:r>
-      </w:fldSimple>
+      <w:r>
+        <w:fldChar w:fldCharType="begin"/>
+      </w:r>
+      <w:r>
+        <w:instrText xml:space="preserve"> STYLEREF 1 \s </w:instrText>
+      </w:r>
+      <w:r>
+        <w:fldChar w:fldCharType="separate"/>
+      </w:r>
+      <w:r>
+        <w:rPr>
+          <w:noProof/>
+        </w:rPr>
+        <w:t>0</w:t>
+      </w:r>
+      <w:r>
+        <w:rPr>
+          <w:noProof/>
+        </w:rPr>
+        <w:fldChar w:fldCharType="end"/>
+      </w:r>
       <w:r>
         <w:t>.</w:t>
       </w:r>
-      <w:fldSimple w:instr=" SEQ Figure \* ARABIC \s 1 ">
-        <w:r>
-          <w:rPr>
-            <w:noProof/>
-          </w:rPr>
-          <w:t>1</w:t>
-        </w:r>
-      </w:fldSimple>
+      <w:r>
+        <w:fldChar w:fldCharType="begin"/>
+      </w:r>
+      <w:r>
+        <w:instrText xml:space="preserve"> SEQ Figure \* ARABIC \s 1 </w:instrText>
+      </w:r>
+      <w:r>
+        <w:fldChar w:fldCharType="separate"/>
+      </w:r>
+      <w:r>
+        <w:rPr>
+          <w:noProof/>
+        </w:rPr>
+        <w:t>1</w:t>
+      </w:r>
+      <w:r>
+        <w:rPr>
+          <w:noProof/>
+        </w:rPr>
+        <w:fldChar w:fldCharType="end"/>
+      </w:r>
       <w:r>
         <w:t xml:space="preserve"> RAG architecture</w:t>
       </w:r>
@@ -173,68 +205,8 @@
           <w:sz w:val="26"/>
           <w:szCs w:val="26"/>
         </w:rPr>
-        <w:t>2. Corpus and provenance</w:t>
-      </w:r>
-    </w:p>
-    <w:p>
-      <w:pPr>
-        <w:spacing w:after="120"/>
-      </w:pPr>
-      <w:r>
-        <w:t>The source data was assembled as a CSV export of Centenary Bank customer FAQ entries, covering</w:t>
-      </w:r>
-      <w:r>
-        <w:t xml:space="preserve"> </w:t>
-      </w:r>
-      <w:r>
-        <w:t>records across product areas e.g. accounts, cards, digital banking, loans. Each record was collected from the public Centenary Bank website FAQ pages.</w:t>
-      </w:r>
-    </w:p>
-    <w:p>
-      <w:pPr>
-        <w:spacing w:after="120"/>
-      </w:pPr>
-      <w:r>
-        <w:t>Provenance is recorded in a manifest file (corpus/</w:t>
-      </w:r>
-      <w:proofErr w:type="spellStart"/>
-      <w:r>
-        <w:t>manifest.json</w:t>
-      </w:r>
-      <w:proofErr w:type="spellEnd"/>
-      <w:r>
-        <w:t xml:space="preserve">) that holds one record per document. The manifest doubles as the Corpus/Source Register deliverable: every record carries at minimum </w:t>
-      </w:r>
-      <w:proofErr w:type="spellStart"/>
-      <w:r>
-        <w:t>doc_id</w:t>
-      </w:r>
-      <w:proofErr w:type="spellEnd"/>
-      <w:r>
-        <w:t>, title and file, and any additional fields (</w:t>
-      </w:r>
-      <w:proofErr w:type="spellStart"/>
-      <w:r>
-        <w:t>source_type</w:t>
-      </w:r>
-      <w:proofErr w:type="spellEnd"/>
-      <w:r>
-        <w:t xml:space="preserve">, </w:t>
-      </w:r>
-      <w:proofErr w:type="spellStart"/>
-      <w:r>
-        <w:t>date_added</w:t>
-      </w:r>
-      <w:proofErr w:type="spellEnd"/>
-      <w:r>
-        <w:t>, category, version) are propagated automatically onto every chunk produced from that document and onto every source returned with an answer. Provenance therefore survives the whole pipeline rather than being lost at ingestion.</w:t>
-      </w:r>
-    </w:p>
-    <w:p>
-      <w:pPr>
-        <w:pStyle w:val="Heading1"/>
-        <w:spacing w:before="240" w:after="120"/>
-      </w:pPr>
+        <w:t>2. Corpus and provenan</w:t>
+      </w:r>
       <w:r>
         <w:rPr>
           <w:b/>
@@ -242,7 +214,7 @@
           <w:sz w:val="26"/>
           <w:szCs w:val="26"/>
         </w:rPr>
-        <w:t>3. Pipeline implementation</w:t>
+        <w:t>ce</w:t>
       </w:r>
     </w:p>
     <w:p>
@@ -250,7 +222,94 @@
         <w:spacing w:after="120"/>
       </w:pPr>
       <w:r>
-        <w:t>The pipeline was implemented as six small Python modules, each owning exactly one stage so that failures can be isolated to a single component. Every module carries a self-test entry point that runs on throwaway strings, so any stage can be exercised without the full corpus.</w:t>
+        <w:t>The source data was assembled as a CSV export of Centenary Bank customer FAQ entries, covering</w:t>
+      </w:r>
+      <w:r>
+        <w:t xml:space="preserve"> </w:t>
+      </w:r>
+      <w:r>
+        <w:t>records across product areas e.g. accounts, cards, digital banking, loans. Each record was collected from the public Centenary Bank website FAQ pages.</w:t>
+      </w:r>
+    </w:p>
+    <w:p>
+      <w:pPr>
+        <w:spacing w:after="120"/>
+      </w:pPr>
+      <w:r>
+        <w:t>Provena</w:t>
+      </w:r>
+      <w:r>
+        <w:t>nce is recorded in a manifest file (corpus/</w:t>
+      </w:r>
+      <w:proofErr w:type="spellStart"/>
+      <w:r>
+        <w:t>manifest.json</w:t>
+      </w:r>
+      <w:proofErr w:type="spellEnd"/>
+      <w:r>
+        <w:t xml:space="preserve">) that holds one record per document. The manifest doubles as the Corpus/Source Register deliverable: every record carries at minimum </w:t>
+      </w:r>
+      <w:proofErr w:type="spellStart"/>
+      <w:r>
+        <w:t>doc_id</w:t>
+      </w:r>
+      <w:proofErr w:type="spellEnd"/>
+      <w:r>
+        <w:t>, title and file, and any additional fields (</w:t>
+      </w:r>
+      <w:proofErr w:type="spellStart"/>
+      <w:r>
+        <w:t>source_type</w:t>
+      </w:r>
+      <w:proofErr w:type="spellEnd"/>
+      <w:r>
+        <w:t xml:space="preserve">, </w:t>
+      </w:r>
+      <w:proofErr w:type="spellStart"/>
+      <w:r>
+        <w:t>da</w:t>
+      </w:r>
+      <w:r>
+        <w:t>te_added</w:t>
+      </w:r>
+      <w:proofErr w:type="spellEnd"/>
+      <w:r>
+        <w:t>, category, version) are propagated automatically onto every chunk produced from that document and onto every source returned with an answer. Provenance therefore survives the whole pipeline rather than being lost at ingestion.</w:t>
+      </w:r>
+    </w:p>
+    <w:p>
+      <w:pPr>
+        <w:pStyle w:val="Heading1"/>
+        <w:spacing w:before="240" w:after="120"/>
+      </w:pPr>
+      <w:r>
+        <w:rPr>
+          <w:b/>
+          <w:bCs/>
+          <w:sz w:val="26"/>
+          <w:szCs w:val="26"/>
+        </w:rPr>
+        <w:t>3. Pipeline implemen</w:t>
+      </w:r>
+      <w:r>
+        <w:rPr>
+          <w:b/>
+          <w:bCs/>
+          <w:sz w:val="26"/>
+          <w:szCs w:val="26"/>
+        </w:rPr>
+        <w:t>tation</w:t>
+      </w:r>
+    </w:p>
+    <w:p>
+      <w:pPr>
+        <w:spacing w:after="120"/>
+      </w:pPr>
+      <w:r>
+        <w:t>The pipeline was implemented as six small Python modules, each owning exactly one stage so that failures can be isolated to a single component. Every module carries a self-test entry point that runs on throwaway strings, so any stage can be exercise</w:t>
+      </w:r>
+      <w:r>
+        <w:t>d without the full corpus.</w:t>
       </w:r>
     </w:p>
     <w:tbl>
@@ -276,12 +335,6 @@
         <w:gridCol w:w="5105"/>
       </w:tblGrid>
       <w:tr>
-        <w:tblPrEx>
-          <w:tblCellMar>
-            <w:top w:w="0" w:type="dxa"/>
-            <w:bottom w:w="0" w:type="dxa"/>
-          </w:tblCellMar>
-        </w:tblPrEx>
         <w:trPr>
           <w:tblHeader/>
         </w:trPr>
@@ -304,7 +357,6 @@
                 <w:sz w:val="18"/>
                 <w:szCs w:val="18"/>
               </w:rPr>
-              <w:lastRenderedPageBreak/>
               <w:t>Module</w:t>
             </w:r>
           </w:p>
@@ -357,12 +409,6 @@
         </w:tc>
       </w:tr>
       <w:tr>
-        <w:tblPrEx>
-          <w:tblCellMar>
-            <w:top w:w="0" w:type="dxa"/>
-            <w:bottom w:w="0" w:type="dxa"/>
-          </w:tblCellMar>
-        </w:tblPrEx>
         <w:tc>
           <w:tcPr>
             <w:tcW w:w="2200" w:type="dxa"/>
@@ -425,12 +471,6 @@
         </w:tc>
       </w:tr>
       <w:tr>
-        <w:tblPrEx>
-          <w:tblCellMar>
-            <w:top w:w="0" w:type="dxa"/>
-            <w:bottom w:w="0" w:type="dxa"/>
-          </w:tblCellMar>
-        </w:tblPrEx>
         <w:tc>
           <w:tcPr>
             <w:tcW w:w="2200" w:type="dxa"/>
@@ -447,6 +487,7 @@
                 <w:sz w:val="18"/>
                 <w:szCs w:val="18"/>
               </w:rPr>
+              <w:lastRenderedPageBreak/>
               <w:t>chunk.py</w:t>
             </w:r>
           </w:p>
@@ -493,12 +534,6 @@
         </w:tc>
       </w:tr>
       <w:tr>
-        <w:tblPrEx>
-          <w:tblCellMar>
-            <w:top w:w="0" w:type="dxa"/>
-            <w:bottom w:w="0" w:type="dxa"/>
-          </w:tblCellMar>
-        </w:tblPrEx>
         <w:tc>
           <w:tcPr>
             <w:tcW w:w="2200" w:type="dxa"/>
@@ -557,18 +592,19 @@
                 <w:sz w:val="18"/>
                 <w:szCs w:val="18"/>
               </w:rPr>
-              <w:t>Build a TF-IDF index over all chunks</w:t>
+              <w:t xml:space="preserve">Build a TF-IDF index over all </w:t>
+            </w:r>
+            <w:r>
+              <w:rPr>
+                <w:sz w:val="18"/>
+                <w:szCs w:val="18"/>
+              </w:rPr>
+              <w:t>chunks</w:t>
             </w:r>
           </w:p>
         </w:tc>
       </w:tr>
       <w:tr>
-        <w:tblPrEx>
-          <w:tblCellMar>
-            <w:top w:w="0" w:type="dxa"/>
-            <w:bottom w:w="0" w:type="dxa"/>
-          </w:tblCellMar>
-        </w:tblPrEx>
         <w:tc>
           <w:tcPr>
             <w:tcW w:w="2200" w:type="dxa"/>
@@ -633,12 +669,6 @@
         </w:tc>
       </w:tr>
       <w:tr>
-        <w:tblPrEx>
-          <w:tblCellMar>
-            <w:top w:w="0" w:type="dxa"/>
-            <w:bottom w:w="0" w:type="dxa"/>
-          </w:tblCellMar>
-        </w:tblPrEx>
         <w:tc>
           <w:tcPr>
             <w:tcW w:w="2200" w:type="dxa"/>
@@ -703,12 +733,6 @@
         </w:tc>
       </w:tr>
       <w:tr>
-        <w:tblPrEx>
-          <w:tblCellMar>
-            <w:top w:w="0" w:type="dxa"/>
-            <w:bottom w:w="0" w:type="dxa"/>
-          </w:tblCellMar>
-        </w:tblPrEx>
         <w:tc>
           <w:tcPr>
             <w:tcW w:w="2200" w:type="dxa"/>
@@ -767,23 +791,7 @@
                 <w:sz w:val="18"/>
                 <w:szCs w:val="18"/>
               </w:rPr>
-              <w:t xml:space="preserve">Wire all stages into a single </w:t>
-            </w:r>
-            <w:proofErr w:type="gramStart"/>
-            <w:r>
-              <w:rPr>
-                <w:sz w:val="18"/>
-                <w:szCs w:val="18"/>
-              </w:rPr>
-              <w:t>answer(</w:t>
-            </w:r>
-            <w:proofErr w:type="gramEnd"/>
-            <w:r>
-              <w:rPr>
-                <w:sz w:val="18"/>
-                <w:szCs w:val="18"/>
-              </w:rPr>
-              <w:t>) call</w:t>
+              <w:t>Wire all stages into a single answer() call</w:t>
             </w:r>
           </w:p>
         </w:tc>
@@ -799,7 +807,13 @@
         <w:spacing w:after="120"/>
       </w:pPr>
       <w:r>
-        <w:t>Chunking is paragraph-aware by default, with a 200-word target and 30-word overlap, falling back to a fixed sliding window for documents with no paragraph structure. These values are provisional: short FAQ entries may warrant smaller chunks, and the parameters will be tuned once evaluation results indicate whether retrieval is returning too much or too little context.</w:t>
+        <w:t xml:space="preserve">Chunking is paragraph-aware by </w:t>
+      </w:r>
+      <w:r>
+        <w:t>default, with a 200-word target and 30-word overlap, falling back to a fixed sliding window for documents with no paragraph structure. These values are provisional: short FAQ entries may warrant smaller chunks, and the parameters will be tuned once evaluat</w:t>
+      </w:r>
+      <w:r>
+        <w:t>ion results indicate whether retrieval is returning too much or too little context.</w:t>
       </w:r>
     </w:p>
     <w:p>
@@ -811,7 +825,10 @@
       </w:r>
       <w:proofErr w:type="gramStart"/>
       <w:r>
-        <w:t>auditable  every</w:t>
+        <w:t>audi</w:t>
+      </w:r>
+      <w:r>
+        <w:t>table  every</w:t>
       </w:r>
       <w:proofErr w:type="gramEnd"/>
       <w:r>
@@ -838,13 +855,19 @@
         <w:spacing w:after="120"/>
       </w:pPr>
       <w:r>
-        <w:t>The context builder returns a ready-made message list (a system message carrying the retrieved evidence and a user message carrying the question), which is passed to Gemini 2.0 Flash</w:t>
+        <w:t>The context builder returns a ready-made message list (a system message carrying the retrieved evidence and a user</w:t>
+      </w:r>
+      <w:r>
+        <w:t xml:space="preserve"> message carrying the question), which is passed to Gemini 2.0 Flash</w:t>
       </w:r>
       <w:r>
         <w:t>,</w:t>
       </w:r>
       <w:r>
-        <w:t xml:space="preserve"> the same foundation model selected in Week 2, so that any change in answer quality is attributable to retrieval rather than to a model switch. The model is instructed to cite inline markers ([S1], [S2], …) that map one-to-one onto the returned source list, so the citation shown to the user is verifiable against the trace rather than generated freely.</w:t>
+        <w:t xml:space="preserve"> the same foundation model selected in Week 2, so that any change in answer quality is attributable to retrieval rather than to a model switch. The model is instructed to cite inline mark</w:t>
+      </w:r>
+      <w:r>
+        <w:t>ers ([S1], [S2], …) that map one-to-one onto the returned source list, so the citation shown to the user is verifiable against the trace rather than generated freely.</w:t>
       </w:r>
     </w:p>
     <w:p>
@@ -852,7 +875,13 @@
         <w:spacing w:after="120"/>
       </w:pPr>
       <w:r>
-        <w:t xml:space="preserve">Two mechanisms support grounding. First, a minimum similarity threshold acts as the safety valve for unanswerable questions: when no chunk scores above it, no evidence is returned and the prompt explicitly directs the model to state that it does not know instead of guessing. Second, each answer is accompanied by a list of source references (document id, chunk id, similarity score and the exact retrieved text), logged alongside the query and answer. This separates the two failure modes that look identical to a </w:t>
+        <w:t>Two mechanisms support grounding. First, a minimum similarity threshold acts as the safet</w:t>
+      </w:r>
+      <w:r>
+        <w:t>y valve for unanswerable questions: when no chunk scores above it, no evidence is returned and the prompt explicitly directs the model to state that it does not know instead of guessing. Second, each answer is accompanied by a list of source references (do</w:t>
+      </w:r>
+      <w:r>
+        <w:t xml:space="preserve">cument id, chunk id, similarity score and the exact retrieved text), logged alongside the query and answer. This separates the two failure modes that look identical to a </w:t>
       </w:r>
       <w:proofErr w:type="gramStart"/>
       <w:r>
@@ -860,7 +889,10 @@
       </w:r>
       <w:proofErr w:type="gramEnd"/>
       <w:r>
-        <w:t xml:space="preserve"> wrong chunk was retrieved, or the right chunk was retrieved and the model ignored it.</w:t>
+        <w:t xml:space="preserve"> wrong chunk was retrieved, or the right chunk was retrieved and the model ig</w:t>
+      </w:r>
+      <w:r>
+        <w:t>nored it.</w:t>
       </w:r>
     </w:p>
     <w:p>
@@ -883,7 +915,10 @@
         <w:spacing w:after="120"/>
       </w:pPr>
       <w:r>
-        <w:t>A 15-question evaluation set was designed across three categories: fully answerable from the corpus, partially answerable (the corpus covers part of the question), and deliberately unanswerable (the question concerns information the corpus does not contain). The partially answerable and unanswerable cases test whether the system declines and defers appropriately rather than filling gaps from model memory.</w:t>
+        <w:t xml:space="preserve">A 15-question evaluation set was designed across three categories: fully answerable from the corpus, partially answerable (the corpus covers part of the question), and deliberately unanswerable (the question concerns </w:t>
+      </w:r>
+      <w:r>
+        <w:t>information the corpus does not contain). The partially answerable and unanswerable cases test whether the system declines and defers appropriately rather than filling gaps from model memory.</w:t>
       </w:r>
     </w:p>
     <w:p>
@@ -939,12 +974,6 @@
         <w:gridCol w:w="1905"/>
       </w:tblGrid>
       <w:tr>
-        <w:tblPrEx>
-          <w:tblCellMar>
-            <w:top w:w="0" w:type="dxa"/>
-            <w:bottom w:w="0" w:type="dxa"/>
-          </w:tblCellMar>
-        </w:tblPrEx>
         <w:trPr>
           <w:tblHeader/>
         </w:trPr>
@@ -1019,12 +1048,6 @@
         </w:tc>
       </w:tr>
       <w:tr>
-        <w:tblPrEx>
-          <w:tblCellMar>
-            <w:top w:w="0" w:type="dxa"/>
-            <w:bottom w:w="0" w:type="dxa"/>
-          </w:tblCellMar>
-        </w:tblPrEx>
         <w:tc>
           <w:tcPr>
             <w:tcW w:w="2600" w:type="dxa"/>
@@ -1087,12 +1110,6 @@
         </w:tc>
       </w:tr>
       <w:tr>
-        <w:tblPrEx>
-          <w:tblCellMar>
-            <w:top w:w="0" w:type="dxa"/>
-            <w:bottom w:w="0" w:type="dxa"/>
-          </w:tblCellMar>
-        </w:tblPrEx>
         <w:tc>
           <w:tcPr>
             <w:tcW w:w="2600" w:type="dxa"/>
@@ -1155,12 +1172,6 @@
         </w:tc>
       </w:tr>
       <w:tr>
-        <w:tblPrEx>
-          <w:tblCellMar>
-            <w:top w:w="0" w:type="dxa"/>
-            <w:bottom w:w="0" w:type="dxa"/>
-          </w:tblCellMar>
-        </w:tblPrEx>
         <w:tc>
           <w:tcPr>
             <w:tcW w:w="2600" w:type="dxa"/>
@@ -1177,14 +1188,7 @@
                 <w:sz w:val="18"/>
                 <w:szCs w:val="18"/>
               </w:rPr>
-              <w:t xml:space="preserve">Walusimbi </w:t>
-            </w:r>
-            <w:r>
-              <w:rPr>
-                <w:sz w:val="18"/>
-                <w:szCs w:val="18"/>
-              </w:rPr>
-              <w:t>Ashraf</w:t>
+              <w:t>Walusimbi Ashraf</w:t>
             </w:r>
           </w:p>
         </w:tc>
@@ -1224,18 +1228,12 @@
                 <w:sz w:val="18"/>
                 <w:szCs w:val="18"/>
               </w:rPr>
-              <w:t>In progress</w:t>
+              <w:t>Delivered</w:t>
             </w:r>
           </w:p>
         </w:tc>
       </w:tr>
       <w:tr>
-        <w:tblPrEx>
-          <w:tblCellMar>
-            <w:top w:w="0" w:type="dxa"/>
-            <w:bottom w:w="0" w:type="dxa"/>
-          </w:tblCellMar>
-        </w:tblPrEx>
         <w:tc>
           <w:tcPr>
             <w:tcW w:w="2600" w:type="dxa"/>
@@ -1252,14 +1250,7 @@
                 <w:sz w:val="18"/>
                 <w:szCs w:val="18"/>
               </w:rPr>
-              <w:t xml:space="preserve">Ssenoga </w:t>
-            </w:r>
-            <w:r>
-              <w:rPr>
-                <w:sz w:val="18"/>
-                <w:szCs w:val="18"/>
-              </w:rPr>
-              <w:t>Herman</w:t>
+              <w:t>Ssenoga Herman</w:t>
             </w:r>
           </w:p>
         </w:tc>
@@ -1348,7 +1339,10 @@
         <w:spacing w:after="60"/>
       </w:pPr>
       <w:r>
-        <w:t>Document at least three retrieval or grounding failures with their diagnosed causes.</w:t>
+        <w:t xml:space="preserve">Document at least three retrieval or grounding failures </w:t>
+      </w:r>
+      <w:r>
+        <w:t>with their diagnosed causes.</w:t>
       </w:r>
     </w:p>
     <w:p>
@@ -1388,7 +1382,15 @@
         <w:spacing w:after="60"/>
       </w:pPr>
       <w:r>
-        <w:t>Expand the corpus beyond FAQ entries to product and policy documents, keeping manifest provenance consistent.</w:t>
+        <w:t>Ex</w:t>
+      </w:r>
+      <w:r>
+        <w:t xml:space="preserve">pand the corpus beyond FAQ entries to product and </w:t>
+      </w:r>
+      <w:bookmarkStart w:id="0" w:name="_GoBack"/>
+      <w:bookmarkEnd w:id="0"/>
+      <w:r>
+        <w:t>policy documents, keeping manifest provenance consistent.</w:t>
       </w:r>
     </w:p>
     <w:sectPr>
@@ -1402,8 +1404,8 @@
 </file>
 
 <file path=word/numbering.xml><?xml version="1.0" encoding="utf-8"?>
-<w:numbering xmlns:wpc="http://schemas.microsoft.com/office/word/2010/wordprocessingCanvas" xmlns:cx="http://schemas.microsoft.com/office/drawing/2014/chartex" xmlns:cx1="http://schemas.microsoft.com/office/drawing/2015/9/8/chartex" xmlns:cx2="http://schemas.microsoft.com/office/drawing/2015/10/21/chartex" xmlns:cx3="http://schemas.microsoft.com/office/drawing/2016/5/9/chartex" xmlns:cx4="http://schemas.microsoft.com/office/drawing/2016/5/10/chartex" xmlns:cx5="http://schemas.microsoft.com/office/drawing/2016/5/11/chartex" xmlns:cx6="http://schemas.microsoft.com/office/drawing/2016/5/12/chartex" xmlns:cx7="http://schemas.microsoft.com/office/drawing/2016/5/13/chartex" xmlns:cx8="http://schemas.microsoft.com/office/drawing/2016/5/14/chartex" xmlns:mc="http://schemas.openxmlformats.org/markup-compatibility/2006" xmlns:aink="http://schemas.microsoft.com/office/drawing/2016/ink" xmlns:am3d="http://schemas.microsoft.com/office/drawing/2017/model3d" xmlns:o="urn:schemas-microsoft-com:office:office" xmlns:oel="http://schemas.microsoft.com/office/2019/extlst" xmlns:r="http://schemas.openxmlformats.org/officeDocument/2006/relationships" xmlns:m="http://schemas.openxmlformats.org/officeDocument/2006/math" xmlns:v="urn:schemas-microsoft-com:vml" xmlns:wp14="http://schemas.microsoft.com/office/word/2010/wordprocessingDrawing" xmlns:wp="http://schemas.openxmlformats.org/drawingml/2006/wordprocessingDrawing" xmlns:w10="urn:schemas-microsoft-com:office:word" xmlns:w="http://schemas.openxmlformats.org/wordprocessingml/2006/main" xmlns:w14="http://schemas.microsoft.com/office/word/2010/wordml" xmlns:w15="http://schemas.microsoft.com/office/word/2012/wordml" xmlns:w16cex="http://schemas.microsoft.com/office/word/2018/wordml/cex" xmlns:w16cid="http://schemas.microsoft.com/office/word/2016/wordml/cid" xmlns:w16="http://schemas.microsoft.com/office/word/2018/wordml" xmlns:w16du="http://schemas.microsoft.com/office/word/2023/wordml/word16du" xmlns:w16sdtdh="http://schemas.microsoft.com/office/word/2020/wordml/sdtdatahash" xmlns:w16sdtfl="http://schemas.microsoft.com/office/word/2024/wordml/sdtformatlock" xmlns:w16se="http://schemas.microsoft.com/office/word/2015/wordml/symex" xmlns:wpg="http://schemas.microsoft.com/office/word/2010/wordprocessingGroup" xmlns:wpi="http://schemas.microsoft.com/office/word/2010/wordprocessingInk" xmlns:wne="http://schemas.microsoft.com/office/word/2006/wordml" xmlns:wps="http://schemas.microsoft.com/office/word/2010/wordprocessingShape" mc:Ignorable="w14 w15 w16se w16cid w16 w16cex w16sdtdh w16sdtfl w16du wp14">
-  <w:abstractNum w:abstractNumId="0" w15:restartNumberingAfterBreak="0">
+<w:numbering xmlns:wpc="http://schemas.microsoft.com/office/word/2010/wordprocessingCanvas" xmlns:mc="http://schemas.openxmlformats.org/markup-compatibility/2006" xmlns:o="urn:schemas-microsoft-com:office:office" xmlns:r="http://schemas.openxmlformats.org/officeDocument/2006/relationships" xmlns:m="http://schemas.openxmlformats.org/officeDocument/2006/math" xmlns:v="urn:schemas-microsoft-com:vml" xmlns:wp14="http://schemas.microsoft.com/office/word/2010/wordprocessingDrawing" xmlns:wp="http://schemas.openxmlformats.org/drawingml/2006/wordprocessingDrawing" xmlns:w10="urn:schemas-microsoft-com:office:word" xmlns:w="http://schemas.openxmlformats.org/wordprocessingml/2006/main" xmlns:w14="http://schemas.microsoft.com/office/word/2010/wordml" xmlns:w15="http://schemas.microsoft.com/office/word/2012/wordml" xmlns:wpg="http://schemas.microsoft.com/office/word/2010/wordprocessingGroup" xmlns:wpi="http://schemas.microsoft.com/office/word/2010/wordprocessingInk" xmlns:wne="http://schemas.microsoft.com/office/word/2006/wordml" xmlns:wps="http://schemas.microsoft.com/office/word/2010/wordprocessingShape" mc:Ignorable="w14 w15 wp14">
+  <w:abstractNum w:abstractNumId="0">
     <w:nsid w:val="08CA5C5E"/>
     <w:multiLevelType w:val="hybridMultilevel"/>
     <w:tmpl w:val="A2AE8DC8"/>
@@ -1489,7 +1491,7 @@
       </w:pPr>
     </w:lvl>
   </w:abstractNum>
-  <w:abstractNum w:abstractNumId="1" w15:restartNumberingAfterBreak="0">
+  <w:abstractNum w:abstractNumId="1">
     <w:nsid w:val="6FE50387"/>
     <w:multiLevelType w:val="hybridMultilevel"/>
     <w:tmpl w:val="06006DFA"/>
@@ -1543,13 +1545,13 @@
       <w:lvlJc w:val="left"/>
     </w:lvl>
   </w:abstractNum>
-  <w:num w:numId="1" w16cid:durableId="580138258">
+  <w:num w:numId="1">
     <w:abstractNumId w:val="0"/>
     <w:lvlOverride w:ilvl="0">
       <w:startOverride w:val="1"/>
     </w:lvlOverride>
   </w:num>
-  <w:num w:numId="2" w16cid:durableId="1538853456">
+  <w:num w:numId="2">
     <w:abstractNumId w:val="1"/>
     <w:lvlOverride w:ilvl="0">
       <w:startOverride w:val="1"/>
@@ -1559,7 +1561,7 @@
 </file>
 
 <file path=word/styles.xml><?xml version="1.0" encoding="utf-8"?>
-<w:styles xmlns:mc="http://schemas.openxmlformats.org/markup-compatibility/2006" xmlns:r="http://schemas.openxmlformats.org/officeDocument/2006/relationships" xmlns:w="http://schemas.openxmlformats.org/wordprocessingml/2006/main" xmlns:w14="http://schemas.microsoft.com/office/word/2010/wordml" xmlns:w15="http://schemas.microsoft.com/office/word/2012/wordml" xmlns:w16cex="http://schemas.microsoft.com/office/word/2018/wordml/cex" xmlns:w16cid="http://schemas.microsoft.com/office/word/2016/wordml/cid" xmlns:w16="http://schemas.microsoft.com/office/word/2018/wordml" xmlns:w16du="http://schemas.microsoft.com/office/word/2023/wordml/word16du" xmlns:w16sdtdh="http://schemas.microsoft.com/office/word/2020/wordml/sdtdatahash" xmlns:w16sdtfl="http://schemas.microsoft.com/office/word/2024/wordml/sdtformatlock" xmlns:w16se="http://schemas.microsoft.com/office/word/2015/wordml/symex" mc:Ignorable="w14 w15 w16se w16cid w16 w16cex w16sdtdh w16sdtfl w16du">
+<w:styles xmlns:mc="http://schemas.openxmlformats.org/markup-compatibility/2006" xmlns:r="http://schemas.openxmlformats.org/officeDocument/2006/relationships" xmlns:w="http://schemas.openxmlformats.org/wordprocessingml/2006/main" xmlns:w14="http://schemas.microsoft.com/office/word/2010/wordml" xmlns:w15="http://schemas.microsoft.com/office/word/2012/wordml" mc:Ignorable="w14 w15">
   <w:docDefaults>
     <w:rPrDefault>
       <w:rPr>
@@ -1569,7 +1571,7 @@
     </w:rPrDefault>
     <w:pPrDefault/>
   </w:docDefaults>
-  <w:latentStyles w:defLockedState="0" w:defUIPriority="99" w:defSemiHidden="0" w:defUnhideWhenUsed="0" w:defQFormat="0" w:count="376">
+  <w:latentStyles w:defLockedState="0" w:defUIPriority="99" w:defSemiHidden="0" w:defUnhideWhenUsed="0" w:defQFormat="0" w:count="371">
     <w:lsdException w:name="Normal" w:uiPriority="0" w:qFormat="1"/>
     <w:lsdException w:name="heading 1" w:uiPriority="9" w:qFormat="1"/>
     <w:lsdException w:name="heading 2" w:semiHidden="1" w:uiPriority="9" w:unhideWhenUsed="1" w:qFormat="1"/>
@@ -1941,11 +1943,6 @@
     <w:lsdException w:name="List Table 5 Dark Accent 6" w:uiPriority="50"/>
     <w:lsdException w:name="List Table 6 Colorful Accent 6" w:uiPriority="51"/>
     <w:lsdException w:name="List Table 7 Colorful Accent 6" w:uiPriority="52"/>
-    <w:lsdException w:name="Mention" w:semiHidden="1" w:unhideWhenUsed="1"/>
-    <w:lsdException w:name="Smart Hyperlink" w:semiHidden="1" w:unhideWhenUsed="1"/>
-    <w:lsdException w:name="Hashtag" w:semiHidden="1" w:unhideWhenUsed="1"/>
-    <w:lsdException w:name="Unresolved Mention" w:semiHidden="1" w:unhideWhenUsed="1"/>
-    <w:lsdException w:name="Smart Link" w:semiHidden="1" w:unhideWhenUsed="1"/>
   </w:latentStyles>
   <w:style w:type="paragraph" w:default="1" w:styleId="Normal">
     <w:name w:val="Normal"/>
@@ -2488,7 +2485,7 @@
 </file>
 
 <file path=customXml/itemProps1.xml><?xml version="1.0" encoding="utf-8"?>
-<ds:datastoreItem xmlns:ds="http://schemas.openxmlformats.org/officeDocument/2006/customXml" ds:itemID="{8A57ECB4-A47A-4446-8F39-8AA24104B93A}">
+<ds:datastoreItem xmlns:ds="http://schemas.openxmlformats.org/officeDocument/2006/customXml" ds:itemID="{A6CA9814-03F1-4FEF-B5CF-410143BA1AC9}">
   <ds:schemaRefs>
     <ds:schemaRef ds:uri="http://schemas.openxmlformats.org/officeDocument/2006/bibliography"/>
   </ds:schemaRefs>

</xml_diff>